<commit_message>
Completed documentation for HW2, noticed a bug with printing with toString() and fixed it
</commit_message>
<xml_diff>
--- a/Week 2-Module 2/Lab 2/Lab2.docx
+++ b/Week 2-Module 2/Lab 2/Lab2.docx
@@ -8,11 +8,12 @@
       </w:pPr>
       <w:r>
         <w:rPr>
-          <w:rFonts w:ascii="Consolas" w:cs="Consolas"/>
-          <w:sz w:val="21"/>
-          <w:szCs w:val="21"/>
-        </w:rPr>
-        <w:t>package hw2;</w:t>
+          <w:rFonts w:ascii="Consolas" w:hAnsi="Aptos" w:eastAsia="Aptos" w:cs="Consolas" w:hAnsiTheme="minorHAnsi" w:eastAsiaTheme="minorHAnsi"/>
+          <w:kern w:val="2"/>
+          <w:sz w:val="21"/>
+          <w:szCs w:val="21"/>
+        </w:rPr>
+        <w:t xml:space="preserve"> public String toStringpackage hw2;</w:t>
       </w:r>
     </w:p>
     <w:p>
@@ -3009,13 +3010,17 @@
       </w:r>
     </w:p>
     <w:p>
-      <w:r>
-        <w:rPr>
-          <w:rFonts w:ascii="Consolas" w:cs="Consolas"/>
-          <w:sz w:val="21"/>
-          <w:szCs w:val="21"/>
-        </w:rPr>
-        <w:t>            if (currentNode != null)</w:t>
+      <w:pPr>
+        <w:spacing w:after="160" w:line="278" w:lineRule="auto"/>
+      </w:pPr>
+      <w:r>
+        <w:rPr>
+          <w:rFonts w:ascii="Consolas" w:hAnsi="Aptos" w:eastAsia="Aptos" w:cs="Consolas" w:hAnsiTheme="minorHAnsi" w:eastAsiaTheme="minorHAnsi"/>
+          <w:kern w:val="2"/>
+          <w:sz w:val="21"/>
+          <w:szCs w:val="21"/>
+        </w:rPr>
+        <w:t>            if (!currentNode.isNull())</w:t>
       </w:r>
     </w:p>
     <w:p>

</xml_diff>